<commit_message>
Update CV research interests
</commit_message>
<xml_diff>
--- a/CV.docx
+++ b/CV.docx
@@ -1445,7 +1445,7 @@
         <w:rPr>
           <w:rFonts w:eastAsia="Cambria"/>
         </w:rPr>
-        <w:t>Computer Vision &amp; Graphics, XR</w:t>
+        <w:t>HCI, Spatial Computing</w:t>
       </w:r>
     </w:p>
     <w:p>
@@ -1461,7 +1461,7 @@
         <w:rPr>
           <w:rFonts w:eastAsia="Cambria"/>
         </w:rPr>
-        <w:t>Human–Computer Interaction, UX / Interactive Content</w:t>
+        <w:t>XR</w:t>
       </w:r>
     </w:p>
     <w:p>
@@ -1477,7 +1477,7 @@
         <w:rPr>
           <w:rFonts w:eastAsia="Cambria"/>
         </w:rPr>
-        <w:t>Game &amp; Media Art</w:t>
+        <w:t>Human-Centered AI</w:t>
       </w:r>
     </w:p>
     <w:p>

</xml_diff>